<commit_message>
Modern portfolio website with glassmorphism UI
</commit_message>
<xml_diff>
--- a/full stack.docx
+++ b/full stack.docx
@@ -4,18 +4,76 @@
   <w:body>
     <w:p>
       <w:pPr>
+        <w:pStyle w:val="Heading1"/>
+        <w:shd w:val="clear" w:color="auto" w:fill="FFFFFF"/>
+        <w:spacing w:before="0" w:after="0"/>
+        <w:jc w:val="center"/>
         <w:rPr>
+          <w:rFonts w:asciiTheme="minorHAnsi" w:hAnsiTheme="minorHAnsi" w:cstheme="minorHAnsi"/>
+          <w:b/>
+          <w:bCs/>
+          <w:color w:val="000000" w:themeColor="text1"/>
+          <w:u w:val="single"/>
           <w:lang w:val="en-US"/>
         </w:rPr>
       </w:pPr>
       <w:proofErr w:type="gramStart"/>
       <w:r>
         <w:rPr>
+          <w:rFonts w:asciiTheme="minorHAnsi" w:hAnsiTheme="minorHAnsi" w:cstheme="minorHAnsi"/>
+          <w:b/>
+          <w:bCs/>
+          <w:color w:val="000000" w:themeColor="text1"/>
+          <w:u w:val="single"/>
           <w:lang w:val="en-US"/>
         </w:rPr>
-        <w:t>Aim:-</w:t>
+        <w:t>P</w:t>
+      </w:r>
+      <w:r>
+        <w:rPr>
+          <w:rFonts w:asciiTheme="minorHAnsi" w:hAnsiTheme="minorHAnsi" w:cstheme="minorHAnsi"/>
+          <w:b/>
+          <w:bCs/>
+          <w:color w:val="000000" w:themeColor="text1"/>
+          <w:u w:val="single"/>
+          <w:lang w:val="en-US"/>
+        </w:rPr>
+        <w:t>ractical</w:t>
+      </w:r>
+      <w:r>
+        <w:rPr>
+          <w:rFonts w:asciiTheme="minorHAnsi" w:hAnsiTheme="minorHAnsi" w:cstheme="minorHAnsi"/>
+          <w:b/>
+          <w:bCs/>
+          <w:color w:val="000000" w:themeColor="text1"/>
+          <w:u w:val="single"/>
+          <w:lang w:val="en-US"/>
+        </w:rPr>
+        <w:t>:-</w:t>
       </w:r>
       <w:proofErr w:type="gramEnd"/>
+      <w:r>
+        <w:rPr>
+          <w:rFonts w:asciiTheme="minorHAnsi" w:hAnsiTheme="minorHAnsi" w:cstheme="minorHAnsi"/>
+          <w:b/>
+          <w:bCs/>
+          <w:color w:val="000000" w:themeColor="text1"/>
+          <w:u w:val="single"/>
+          <w:lang w:val="en-US"/>
+        </w:rPr>
+        <w:t xml:space="preserve"> </w:t>
+      </w:r>
+      <w:r>
+        <w:rPr>
+          <w:rFonts w:asciiTheme="minorHAnsi" w:hAnsiTheme="minorHAnsi" w:cstheme="minorHAnsi"/>
+          <w:b/>
+          <w:bCs/>
+          <w:color w:val="000000" w:themeColor="text1"/>
+          <w:u w:val="single"/>
+          <w:lang w:val="en-US"/>
+        </w:rPr>
+        <w:t>1</w:t>
+      </w:r>
     </w:p>
     <w:p>
       <w:pPr>
@@ -23,14 +81,61 @@
           <w:lang w:val="en-US"/>
         </w:rPr>
       </w:pPr>
+    </w:p>
+    <w:p>
+      <w:pPr>
+        <w:pStyle w:val="Heading1"/>
+        <w:shd w:val="clear" w:color="auto" w:fill="FFFFFF"/>
+        <w:spacing w:before="0" w:after="0"/>
+        <w:rPr>
+          <w:rFonts w:ascii="Open Sans" w:hAnsi="Open Sans" w:cs="Open Sans"/>
+          <w:color w:val="000000" w:themeColor="text1"/>
+          <w:sz w:val="33"/>
+          <w:szCs w:val="33"/>
+        </w:rPr>
+      </w:pPr>
       <w:proofErr w:type="gramStart"/>
       <w:r>
         <w:rPr>
+          <w:rFonts w:asciiTheme="minorHAnsi" w:hAnsiTheme="minorHAnsi" w:cstheme="minorHAnsi"/>
+          <w:color w:val="000000" w:themeColor="text1"/>
+          <w:sz w:val="24"/>
+          <w:szCs w:val="24"/>
           <w:lang w:val="en-US"/>
         </w:rPr>
-        <w:t>Input:-</w:t>
+        <w:t>Aim:-</w:t>
       </w:r>
       <w:proofErr w:type="gramEnd"/>
+      <w:r>
+        <w:rPr>
+          <w:rFonts w:ascii="Open Sans" w:hAnsi="Open Sans" w:cs="Open Sans"/>
+          <w:b/>
+          <w:bCs/>
+          <w:color w:val="000000" w:themeColor="text1"/>
+          <w:sz w:val="22"/>
+          <w:szCs w:val="22"/>
+        </w:rPr>
+        <w:t xml:space="preserve"> </w:t>
+      </w:r>
+      <w:r>
+        <w:rPr>
+          <w:rFonts w:cstheme="majorHAnsi"/>
+          <w:b/>
+          <w:bCs/>
+          <w:color w:val="000000" w:themeColor="text1"/>
+          <w:sz w:val="24"/>
+          <w:szCs w:val="24"/>
+        </w:rPr>
+        <w:t>Install VS Code, Git, and configure the development environment and Create a GitHub account and push your first repository</w:t>
+      </w:r>
+    </w:p>
+    <w:p>
+      <w:pPr>
+        <w:rPr>
+          <w:color w:val="000000" w:themeColor="text1"/>
+          <w:lang w:val="en-US"/>
+        </w:rPr>
+      </w:pPr>
     </w:p>
     <w:p>
       <w:pPr>
@@ -53,9 +158,96 @@
           <w:lang w:val="en-US"/>
         </w:rPr>
       </w:pPr>
+      <w:r>
+        <w:rPr>
+          <w:lang w:val="en-US"/>
+        </w:rPr>
+        <w:drawing>
+          <wp:inline distT="0" distB="0" distL="0" distR="0" wp14:anchorId="3371F4E0" wp14:editId="416C35E3">
+            <wp:extent cx="5731510" cy="3790315"/>
+            <wp:effectExtent l="0" t="0" r="2540" b="635"/>
+            <wp:docPr id="1" name="Picture 1"/>
+            <wp:cNvGraphicFramePr>
+              <a:graphicFrameLocks xmlns:a="http://schemas.openxmlformats.org/drawingml/2006/main" noChangeAspect="1"/>
+            </wp:cNvGraphicFramePr>
+            <a:graphic xmlns:a="http://schemas.openxmlformats.org/drawingml/2006/main">
+              <a:graphicData uri="http://schemas.openxmlformats.org/drawingml/2006/picture">
+                <pic:pic xmlns:pic="http://schemas.openxmlformats.org/drawingml/2006/picture">
+                  <pic:nvPicPr>
+                    <pic:cNvPr id="1" name=""/>
+                    <pic:cNvPicPr/>
+                  </pic:nvPicPr>
+                  <pic:blipFill>
+                    <a:blip r:embed="rId6"/>
+                    <a:stretch>
+                      <a:fillRect/>
+                    </a:stretch>
+                  </pic:blipFill>
+                  <pic:spPr>
+                    <a:xfrm>
+                      <a:off x="0" y="0"/>
+                      <a:ext cx="5731510" cy="3790315"/>
+                    </a:xfrm>
+                    <a:prstGeom prst="rect">
+                      <a:avLst/>
+                    </a:prstGeom>
+                  </pic:spPr>
+                </pic:pic>
+              </a:graphicData>
+            </a:graphic>
+          </wp:inline>
+        </w:drawing>
+      </w:r>
+    </w:p>
+    <w:p>
+      <w:pPr>
+        <w:rPr>
+          <w:lang w:val="en-US"/>
+        </w:rPr>
+      </w:pPr>
+      <w:r>
+        <w:rPr>
+          <w:lang w:val="en-US"/>
+        </w:rPr>
+        <w:drawing>
+          <wp:inline distT="0" distB="0" distL="0" distR="0" wp14:anchorId="0B5C5BD8" wp14:editId="7F6C2F08">
+            <wp:extent cx="5731510" cy="2325370"/>
+            <wp:effectExtent l="0" t="0" r="2540" b="0"/>
+            <wp:docPr id="2" name="Picture 2"/>
+            <wp:cNvGraphicFramePr>
+              <a:graphicFrameLocks xmlns:a="http://schemas.openxmlformats.org/drawingml/2006/main" noChangeAspect="1"/>
+            </wp:cNvGraphicFramePr>
+            <a:graphic xmlns:a="http://schemas.openxmlformats.org/drawingml/2006/main">
+              <a:graphicData uri="http://schemas.openxmlformats.org/drawingml/2006/picture">
+                <pic:pic xmlns:pic="http://schemas.openxmlformats.org/drawingml/2006/picture">
+                  <pic:nvPicPr>
+                    <pic:cNvPr id="1" name=""/>
+                    <pic:cNvPicPr/>
+                  </pic:nvPicPr>
+                  <pic:blipFill>
+                    <a:blip r:embed="rId7"/>
+                    <a:stretch>
+                      <a:fillRect/>
+                    </a:stretch>
+                  </pic:blipFill>
+                  <pic:spPr>
+                    <a:xfrm>
+                      <a:off x="0" y="0"/>
+                      <a:ext cx="5731510" cy="2325370"/>
+                    </a:xfrm>
+                    <a:prstGeom prst="rect">
+                      <a:avLst/>
+                    </a:prstGeom>
+                  </pic:spPr>
+                </pic:pic>
+              </a:graphicData>
+            </a:graphic>
+          </wp:inline>
+        </w:drawing>
+      </w:r>
     </w:p>
     <w:sectPr>
-      <w:headerReference w:type="default" r:id="rId6"/>
+      <w:headerReference w:type="default" r:id="rId8"/>
       <w:pgSz w:w="11906" w:h="16838"/>
       <w:pgMar w:top="1440" w:right="1440" w:bottom="1440" w:left="1440" w:header="708" w:footer="708" w:gutter="0"/>
       <w:cols w:space="708"/>

</xml_diff>